<commit_message>
Add write-up tone rule and enforce neutral research-paper tone across all write-ups
</commit_message>
<xml_diff>
--- a/writeups/docx/01_surface_code_simulator.docx
+++ b/writeups/docx/01_surface_code_simulator.docx
@@ -8,7 +8,7 @@
         <w:jc w:val="left"/>
       </w:pPr>
       <w:r>
-        <w:t>A Transparent Circuit-Level Surface-Code Memory Simulator with Threshold Estimation</w:t>
+        <w:t>A Circuit-Level Surface-Code Memory Simulator with Threshold Estimation</w:t>
       </w:r>
     </w:p>
     <w:p>
@@ -42,7 +42,7 @@
         <w:spacing w:after="120"/>
       </w:pPr>
       <w:r>
-        <w:t>A circuit-level Monte Carlo simulator for the surface code was implemented on top of Stim and PyMatching to study the logical performance of the code as a quantum memory. The simulator builds surface-code memory circuits, applies a single physical error rate uniformly across all circuit-level noise channels, samples detection events, decodes them with minimum-weight perfect matching derived from the circuit's detector error model, and tracks logical failures with Wilson confidence intervals. A threshold sweep over code distances three, five and seven and physical error rates between 0.5% and 1.5% located the threshold near 0.6%, below which the logical error rate was suppressed with increasing code distance. The result is consistent with the accepted range for circuit-level depolarising noise and provides a transparent, testable foundation for the rest of the portfolio.</w:t>
+        <w:t>A circuit-level Monte Carlo simulator for the surface code was implemented on top of Stim and PyMatching to study the logical performance of the code as a quantum memory. The simulator builds surface-code memory circuits, applies a single physical error rate uniformly across all circuit-level noise channels, samples detection events, decodes them with minimum-weight perfect matching derived from the circuit's detector error model, and tracks logical failures with Wilson confidence intervals. A threshold sweep over code distances three, five and seven and physical error rates between 0.5% and 1.5% located the threshold near 0.6%, below which the logical error rate was suppressed with increasing code distance. The result is consistent with the accepted range for circuit-level depolarising noise and provides a testable foundation for the rest of the portfolio.</w:t>
       </w:r>
     </w:p>
     <w:p>

</xml_diff>